<commit_message>
Added Self-Healing Data Pipeline Platform - replaces Hyperlocal Ad
</commit_message>
<xml_diff>
--- a/public/projects/Christopher_Pienaah_Resume.docx
+++ b/public/projects/Christopher_Pienaah_Resume.docx
@@ -69,12 +69,16 @@
       <w:r>
         <w:t xml:space="preserve">  •  </w:t>
       </w:r>
-      <w:r>
-        <w:rPr>
-          <w:rStyle w:val="Hyperlink"/>
-        </w:rPr>
-        <w:t>Portfolio</w:t>
-      </w:r>
+      <w:hyperlink r:id="rId7" w:history="1">
+        <w:proofErr w:type="spellStart"/>
+        <w:r>
+          <w:rPr>
+            <w:rStyle w:val="Hyperlink"/>
+          </w:rPr>
+          <w:t>Portfolio</w:t>
+        </w:r>
+      </w:hyperlink>
+      <w:proofErr w:type="spellEnd"/>
     </w:p>
     <w:p>
       <w:pPr>
@@ -295,51 +299,51 @@
           <w:sz w:val="22"/>
           <w:szCs w:val="22"/>
         </w:rPr>
-        <w:t xml:space="preserve">Built </w:t>
-      </w:r>
+        <w:t>Built a custom CRM system from scratch that automated lead tracking and cut manual work by 80%</w:t>
+      </w:r>
+    </w:p>
+    <w:p>
+      <w:pPr>
+        <w:pStyle w:val="Default"/>
+        <w:numPr>
+          <w:ilvl w:val="0"/>
+          <w:numId w:val="2"/>
+        </w:numPr>
+      </w:pPr>
       <w:r>
         <w:rPr>
           <w:sz w:val="22"/>
           <w:szCs w:val="22"/>
         </w:rPr>
-        <w:t xml:space="preserve">a </w:t>
+        <w:t>Optimized GPT-4 prompts for document summarization</w:t>
       </w:r>
       <w:r>
         <w:rPr>
           <w:sz w:val="22"/>
           <w:szCs w:val="22"/>
         </w:rPr>
-        <w:t>custom CRM system from scratch that automated lead tracking and cut manual work by 80%</w:t>
-      </w:r>
-    </w:p>
-    <w:p>
-      <w:pPr>
-        <w:pStyle w:val="Default"/>
-        <w:numPr>
-          <w:ilvl w:val="0"/>
-          <w:numId w:val="2"/>
-        </w:numPr>
-      </w:pPr>
+        <w:t xml:space="preserve"> </w:t>
+      </w:r>
       <w:r>
         <w:rPr>
           <w:sz w:val="22"/>
           <w:szCs w:val="22"/>
         </w:rPr>
-        <w:t>Optimized GPT-4 prompts for document summarization</w:t>
+        <w:t xml:space="preserve">improved relevance </w:t>
       </w:r>
       <w:r>
         <w:rPr>
           <w:sz w:val="22"/>
           <w:szCs w:val="22"/>
         </w:rPr>
-        <w:t xml:space="preserve"> </w:t>
+        <w:t xml:space="preserve">by </w:t>
       </w:r>
       <w:r>
         <w:rPr>
           <w:sz w:val="22"/>
           <w:szCs w:val="22"/>
         </w:rPr>
-        <w:t xml:space="preserve">improved relevance </w:t>
+        <w:t xml:space="preserve">20% while cutting token costs </w:t>
       </w:r>
       <w:r>
         <w:rPr>
@@ -353,21 +357,30 @@
           <w:sz w:val="22"/>
           <w:szCs w:val="22"/>
         </w:rPr>
-        <w:t xml:space="preserve">20% while cutting token costs </w:t>
-      </w:r>
-      <w:r>
+        <w:t>15%</w:t>
+      </w:r>
+      <w:r>
+        <w:t xml:space="preserve"> </w:t>
+      </w:r>
+    </w:p>
+    <w:p>
+      <w:pPr>
+        <w:pStyle w:val="Default"/>
+        <w:numPr>
+          <w:ilvl w:val="0"/>
+          <w:numId w:val="2"/>
+        </w:numPr>
         <w:rPr>
           <w:sz w:val="22"/>
           <w:szCs w:val="22"/>
         </w:rPr>
-        <w:t xml:space="preserve">by </w:t>
-      </w:r>
+      </w:pPr>
       <w:r>
         <w:rPr>
           <w:sz w:val="22"/>
           <w:szCs w:val="22"/>
         </w:rPr>
-        <w:t>15%</w:t>
+        <w:t>Automated 450K daily records processing through Python + SQL pipelines, reducing manual analysis from 10 hours to 1 hour</w:t>
       </w:r>
       <w:r>
         <w:t xml:space="preserve"> </w:t>
@@ -390,10 +403,7 @@
           <w:sz w:val="22"/>
           <w:szCs w:val="22"/>
         </w:rPr>
-        <w:t>Automated 450K daily records processing through Python + SQL pipelines, reducing manual analysis from 10 hours to 1 hour</w:t>
-      </w:r>
-      <w:r>
-        <w:t xml:space="preserve"> </w:t>
+        <w:t>Created Tableau dashboards that executives actually use, turned raw data into insights that drove strategic decisions</w:t>
       </w:r>
     </w:p>
     <w:p>
@@ -413,78 +423,7 @@
           <w:sz w:val="22"/>
           <w:szCs w:val="22"/>
         </w:rPr>
-        <w:t xml:space="preserve">Created Tableau dashboards </w:t>
-      </w:r>
-      <w:r>
-        <w:rPr>
-          <w:sz w:val="22"/>
-          <w:szCs w:val="22"/>
-        </w:rPr>
-        <w:t xml:space="preserve">that </w:t>
-      </w:r>
-      <w:r>
-        <w:rPr>
-          <w:sz w:val="22"/>
-          <w:szCs w:val="22"/>
-        </w:rPr>
-        <w:t xml:space="preserve">executives </w:t>
-      </w:r>
-      <w:proofErr w:type="gramStart"/>
-      <w:r>
-        <w:rPr>
-          <w:sz w:val="22"/>
-          <w:szCs w:val="22"/>
-        </w:rPr>
-        <w:t>actually use</w:t>
-      </w:r>
-      <w:proofErr w:type="gramEnd"/>
-      <w:r>
-        <w:rPr>
-          <w:sz w:val="22"/>
-          <w:szCs w:val="22"/>
-        </w:rPr>
-        <w:t xml:space="preserve">, </w:t>
-      </w:r>
-      <w:r>
-        <w:rPr>
-          <w:sz w:val="22"/>
-          <w:szCs w:val="22"/>
-        </w:rPr>
-        <w:t>turned raw data into insights that drove strategic decisions</w:t>
-      </w:r>
-    </w:p>
-    <w:p>
-      <w:pPr>
-        <w:pStyle w:val="Default"/>
-        <w:numPr>
-          <w:ilvl w:val="0"/>
-          <w:numId w:val="2"/>
-        </w:numPr>
-        <w:rPr>
-          <w:sz w:val="22"/>
-          <w:szCs w:val="22"/>
-        </w:rPr>
-      </w:pPr>
-      <w:r>
-        <w:rPr>
-          <w:sz w:val="22"/>
-          <w:szCs w:val="22"/>
-        </w:rPr>
-        <w:t>Implemented data quality checks</w:t>
-      </w:r>
-      <w:r>
-        <w:rPr>
-          <w:sz w:val="22"/>
-          <w:szCs w:val="22"/>
-        </w:rPr>
-        <w:t>,</w:t>
-      </w:r>
-      <w:r>
-        <w:rPr>
-          <w:sz w:val="22"/>
-          <w:szCs w:val="22"/>
-        </w:rPr>
-        <w:t xml:space="preserve"> ensuring 99.9% accuracy across multiple sources (saved hours of cleanup work)</w:t>
+        <w:t>Implemented data quality checks, ensuring 99.9% accuracy across multiple sources (saved hours of cleanup work)</w:t>
       </w:r>
     </w:p>
     <w:p>
@@ -642,10 +581,7 @@
         <w:pStyle w:val="JobTitle"/>
       </w:pPr>
       <w:r>
-        <w:t xml:space="preserve">An </w:t>
-      </w:r>
-      <w:r>
-        <w:t>AI system that generates radiology reports doctors trust (92% accuracy, 3% hallucination rate)</w:t>
+        <w:t>An AI system that generates radiology reports doctors trust (92% accuracy, 3% hallucination rate)</w:t>
       </w:r>
     </w:p>
     <w:p>
@@ -710,10 +646,7 @@
         <w:pStyle w:val="JobTitle"/>
       </w:pPr>
       <w:r>
-        <w:t>A property</w:t>
-      </w:r>
-      <w:r>
-        <w:t xml:space="preserve"> verification system that addresses the 68% trust barrier in diaspora real estate investment</w:t>
+        <w:t>A property verification system that addresses the 68% trust barrier in diaspora real estate investment</w:t>
       </w:r>
     </w:p>
     <w:p>
@@ -1029,10 +962,7 @@
         <w:t xml:space="preserve">Certifications: </w:t>
       </w:r>
       <w:r>
-        <w:t>5-Day AI Agents Intensive (Kaggle + Google, Dec 2025)</w:t>
-      </w:r>
-      <w:r>
-        <w:t xml:space="preserve"> | </w:t>
+        <w:t xml:space="preserve">5-Day AI Agents Intensive (Kaggle + Google, Dec 2025) | </w:t>
       </w:r>
       <w:r>
         <w:t>AWS Generative AI (Udacity, 2025) | Applied AI &amp; No-Code Development (DTTP, 2025) | Google Data Analytics (2024)</w:t>
@@ -1702,6 +1632,7 @@
   <w:style w:type="character" w:default="1" w:styleId="DefaultParagraphFont">
     <w:name w:val="Default Paragraph Font"/>
     <w:uiPriority w:val="1"/>
+    <w:semiHidden/>
     <w:unhideWhenUsed/>
   </w:style>
   <w:style w:type="table" w:default="1" w:styleId="TableNormal">

</xml_diff>